<commit_message>
docs(master-prompt): add formatted .docx deliverable of the master prompt
</commit_message>
<xml_diff>
--- a/docs/MASTER_PROMPT_OrderWorder_2026-07-24.docx
+++ b/docs/MASTER_PROMPT_OrderWorder_2026-07-24.docx
@@ -18635,26 +18635,26 @@
           <w:i w:val="0"/>
           <w:sz w:val="22"/>
         </w:rPr>
-        <w:t xml:space="preserve">Locate the token beginning with </w:t>
-      </w:r>
-      <w:r>
-        <w:rPr>
-          <w:rFonts w:ascii="Consolas" w:hAnsi="Consolas" w:cs="Consolas"/>
-          <w:b w:val="0"/>
-          <w:i w:val="0"/>
-          <w:color w:val="C03910"/>
-          <w:sz w:val="20"/>
-        </w:rPr>
-        <w:t>github_pat_11BNXWNYQ...</w:t>
-      </w:r>
-      <w:r>
-        <w:rPr>
-          <w:rFonts w:ascii="Times New Roman" w:hAnsi="Times New Roman" w:cs="Times New Roman"/>
-          <w:b w:val="0"/>
-          <w:i w:val="0"/>
-          <w:sz w:val="22"/>
-        </w:rPr>
-        <w:t>.</w:t>
+        <w:t xml:space="preserve">Locate the fine-grained PAT scoped to the </w:t>
+      </w:r>
+      <w:r>
+        <w:rPr>
+          <w:rFonts w:ascii="Consolas" w:hAnsi="Consolas" w:cs="Consolas"/>
+          <w:b w:val="0"/>
+          <w:i w:val="0"/>
+          <w:color w:val="C03910"/>
+          <w:sz w:val="20"/>
+        </w:rPr>
+        <w:t>Resturant</w:t>
+      </w:r>
+      <w:r>
+        <w:rPr>
+          <w:rFonts w:ascii="Times New Roman" w:hAnsi="Times New Roman" w:cs="Times New Roman"/>
+          <w:b w:val="0"/>
+          <w:i w:val="0"/>
+          <w:sz w:val="22"/>
+        </w:rPr>
+        <w:t xml:space="preserve"> repository (the one used for this push).</w:t>
       </w:r>
     </w:p>
     <w:p>

</xml_diff>